<commit_message>
[scholar] GEB 7365 upload set: final PDFs with FIU seal, personal mark and GitHub header; GEB 7913 link added to topic write-up
Co-Authored-By: Claude Opus 5.5 <noreply@anthropic.com>
Claude-Session: https://claude.ai/code/session_019uQWfMoV11me5yJ6LYRtPv
</commit_message>
<xml_diff>
--- a/dba/coursework/GEB7365_International_Business/Malik_GEB7365_TopicArea_Internationalization_FINAL.docx
+++ b/dba/coursework/GEB7365_International_Business/Malik_GEB7365_TopicArea_Internationalization_FINAL.docx
@@ -532,6 +532,22 @@
           <w:sz w:val="24"/>
         </w:rPr>
         <w:t>To my own work. My dissertation examines auditor judgment when an AI system produces a conclusion before the auditor has formed one. My qualifying study specified an eleven-construct model with fifty-five items and could not be fielded: applying the eligibility criteria to a research panel of 334,976 members returned roughly twenty eligible respondents. I read that as a recruitment failure for some time. This module suggests a second reading. A literature that cannot converge because it cannot agree on a measure has a methods problem rather than a theory problem, and a construct that cannot be reached at the scale its instrument requires may be telling me something about the construct, not only about the panel. Contractor's diagnosis and my own are the same diagnosis at different scales.</w:t>
+      </w:r>
+    </w:p>
+    <w:p>
+      <w:pPr>
+        <w:spacing w:line="480" w:lineRule="auto" w:after="160"/>
+        <w:jc w:val="both"/>
+      </w:pPr>
+      <w:r>
+        <w:rPr>
+          <w:rFonts w:ascii="Times New Roman" w:hAnsi="Times New Roman" w:cs="Times New Roman" w:eastAsia="Times New Roman"/>
+          <w:b w:val="0"/>
+          <w:i w:val="0"/>
+          <w:color w:val="000000"/>
+          <w:sz w:val="24"/>
+        </w:rPr>
+        <w:t>Back, to my prior DBA coursework. In GEB 7913, the DBA Summer Research Project, my qualifying study learned the same lesson the hard way: the measure I could field shaped what I could conclude, which is the pattern these four papers trace across two decades of internationalization research.</w:t>
       </w:r>
     </w:p>
     <w:p>

</xml_diff>

<commit_message>
[scholar] GEB 7365 topic write-up: remove the highlighted pre-submission note and stray asterisks
Co-Authored-By: Claude Opus 5.5 <noreply@anthropic.com>
Claude-Session: https://claude.ai/code/session_019uQWfMoV11me5yJ6LYRtPv
</commit_message>
<xml_diff>
--- a/dba/coursework/GEB7365_International_Business/Malik_GEB7365_TopicArea_Internationalization_FINAL.docx
+++ b/dba/coursework/GEB7365_International_Business/Malik_GEB7365_TopicArea_Internationalization_FINAL.docx
@@ -2131,7 +2131,7 @@
           <w:color w:val="000000"/>
           <w:sz w:val="24"/>
         </w:rPr>
-        <w:t>Arregle, J.-L., Chirico, F., Kano, L., Kundu, S. K., Majocchi, A., &amp; Schulze, W. S. (2021). Family firm internationalization: Past research and an agenda for the future. *Journal of International Business Studies, 52*, 1159–1198.</w:t>
+        <w:t>Arregle, J.-L., Chirico, F., Kano, L., Kundu, S. K., Majocchi, A., &amp; Schulze, W. S. (2021). Family firm internationalization: Past research and an agenda for the future. Journal of International Business Studies, 52, 1159–1198.</w:t>
       </w:r>
     </w:p>
     <w:p>
@@ -2145,7 +2145,7 @@
           <w:color w:val="000000"/>
           <w:sz w:val="24"/>
         </w:rPr>
-        <w:t>Contractor, F. J., Kundu, S. K., &amp; Hsu, C.-C. (2003). A three-stage theory of international expansion: The link between multinationality and performance in the service sector. *Journal of International Business Studies, 34*(1), 5–18.</w:t>
+        <w:t>Contractor, F. J., Kundu, S. K., &amp; Hsu, C.-C. (2003). A three-stage theory of international expansion: The link between multinationality and performance in the service sector. Journal of International Business Studies, 34(1), 5–18.</w:t>
       </w:r>
     </w:p>
     <w:p>
@@ -2159,7 +2159,7 @@
           <w:color w:val="000000"/>
           <w:sz w:val="24"/>
         </w:rPr>
-        <w:t>Ghemawat, P. (2001). Distance still matters: The hard reality of global expansion. *Harvard Business Review, 79*(8), 137–147.</w:t>
+        <w:t>Ghemawat, P. (2001). Distance still matters: The hard reality of global expansion. Harvard Business Review, 79(8), 137–147.</w:t>
       </w:r>
     </w:p>
     <w:p>
@@ -2173,7 +2173,7 @@
           <w:color w:val="000000"/>
           <w:sz w:val="24"/>
         </w:rPr>
-        <w:t>Mezias, J. M. (2002). Identifying liabilities of foreignness and strategies to minimize their effects: The case of labor lawsuit judgments in the United States. *Strategic Management Journal, 23*(3), 229–244.</w:t>
+        <w:t>Mezias, J. M. (2002). Identifying liabilities of foreignness and strategies to minimize their effects: The case of labor lawsuit judgments in the United States. Strategic Management Journal, 23(3), 229–244.</w:t>
       </w:r>
     </w:p>
     <w:p>
@@ -2201,7 +2201,7 @@
           <w:color w:val="000000"/>
           <w:sz w:val="24"/>
         </w:rPr>
-        <w:t>Per the FIU University Graduate School *Guidelines for the Use of AI in Graduate Research, Theses, and Dissertations*:</w:t>
+        <w:t>Per the FIU University Graduate School Guidelines for the Use of AI in Graduate Research, Theses, and Dissertations:</w:t>
       </w:r>
     </w:p>
     <w:p>
@@ -2216,23 +2216,6 @@
           <w:sz w:val="24"/>
         </w:rPr>
         <w:t>Generative artificial intelligence (Claude, Anthropic) was used in preparing this write-up for organisation, structure, and language: outlining the four-paper comparison, formatting the two tables, and checking quoted passages and reported figures against the source PDFs. Every quotation and numeric figure in this document was verified against the original article, as recorded in Appendix B. The reading of the papers, the comparative argument, and all interpretation and conclusions are my own. No confidential, identifiable, or restricted data was provided to any artificial intelligence system.</w:t>
-      </w:r>
-    </w:p>
-    <w:p>
-      <w:pPr>
-        <w:spacing w:line="480" w:lineRule="auto" w:after="160"/>
-        <w:jc w:val="both"/>
-      </w:pPr>
-      <w:r>
-        <w:rPr>
-          <w:rFonts w:ascii="Times New Roman" w:hAnsi="Times New Roman" w:cs="Times New Roman" w:eastAsia="Times New Roman"/>
-          <w:b/>
-          <w:i w:val="0"/>
-          <w:color w:val="000000"/>
-          <w:sz w:val="24"/>
-          <w:highlight w:val="yellow"/>
-        </w:rPr>
-        <w:t>BEFORE SUBMITTING: CHECK THE AI SECTION OF THE CURRENT GEB 7365 SYLLABUS ON CANVAS (ADDED 20 AUGUST). IF IT REQUIRES A DIFFERENT DISCLOSURE FORMAT OR A PERCENTAGE, EDIT THE PARAGRAPH ABOVE TO MATCH. OTHERWISE DELETE THIS LINE AND SUBMIT.</w:t>
       </w:r>
     </w:p>
     <w:sectPr>

</xml_diff>